<commit_message>
chore: remove "hobby" from all product names and descriptive text
- UI: App header, Results print heading, PrintView submittal title
- Docs: manual.md, developer.md, waiver-template.md, build.sh
- HTML/PDF: methodology.html, waiver-template.html; PDFs and .docx rebuilt
- Generic uses: "hobby rockets" → "rockets", "hobbyists" → "rocketeers",
  "hobby build" → "build", "hobby rocketry" → "rocketry"

Product name is now "FAA Rocket Hazard Zone Calculator" throughout.

Co-Authored-By: Claude Sonnet 4.6 <noreply@anthropic.com>
</commit_message>
<xml_diff>
--- a/hazard-zone-calculator/docs/pdf/waiver-template.docx
+++ b/hazard-zone-calculator/docs/pdf/waiver-template.docx
@@ -58,7 +58,7 @@
         <w:t xml:space="preserve"> </w:t>
       </w:r>
       <w:r>
-        <w:t xml:space="preserve">FAA Hobby Rocket Hazard Zone Calculator</w:t>
+        <w:t xml:space="preserve">FAA Rocket Hazard Zone Calculator</w:t>
       </w:r>
       <w:r>
         <w:br/>
@@ -78,7 +78,7 @@
           <w:i/>
           <w:iCs/>
         </w:rPr>
-        <w:t xml:space="preserve">FAA Hobby Rocket Hazard Zone Calculator — Methodology</w:t>
+        <w:t xml:space="preserve">FAA Rocket Hazard Zone Calculator — Methodology</w:t>
       </w:r>
       <w:r>
         <w:t xml:space="preserve"> </w:t>
@@ -710,7 +710,7 @@
           <w:b/>
           <w:bCs/>
         </w:rPr>
-        <w:t xml:space="preserve">FAA Hobby Rocket Hazard Zone Calculator</w:t>
+        <w:t xml:space="preserve">FAA Rocket Hazard Zone Calculator</w:t>
       </w:r>
       <w:r>
         <w:t xml:space="preserve">, a web-based 3-DOF point-mass trajectory simulation tool developed by the Advanced Propulsion Association. The tool’s methodology is documented in the accompanying methodology document.</w:t>

</xml_diff>